<commit_message>
Add render_mermaid.py for generating PNG diagrams from Mermaid source
- Implemented a script to render Mermaid diagrams from a JSON input.
- The script checks for the availability of the Mermaid CLI and handles rendering.
- Outputs rendered PNG files and updates the JSON with paths to the images.
- Includes error handling and generates a report on the rendering process.
</commit_message>
<xml_diff>
--- a/src/etc_docgen/assets/templates/huong-dan-su-dung.docx
+++ b/src/etc_docgen/assets/templates/huong-dan-su-dung.docx
@@ -4449,7 +4449,7 @@
     </w:p>
     <w:p>
       <w:pPr>
-        <w:pStyle w:val="ETC_Content"/>
+        <w:pStyle w:val="ETCContent"/>
       </w:pPr>
       <w:r>
         <w:t xml:space="preserve">{{ overview.purpose }}</w:t>
@@ -4501,7 +4501,7 @@
     </w:p>
     <w:p>
       <w:pPr>
-        <w:pStyle w:val="ETC_Content"/>
+        <w:pStyle w:val="ETCContent"/>
       </w:pPr>
       <w:r>
         <w:t xml:space="preserve">{{ overview.scope }}</w:t>
@@ -5757,6 +5757,84 @@
         <w:pStyle w:val="ETCContent"/>
       </w:pPr>
       <w:r>
+        <w:t xml:space="preserve">{%p if feat.dialogs %}</w:t>
+      </w:r>
+    </w:p>
+    <w:p>
+      <w:pPr>
+        <w:pStyle w:val="ETCContent"/>
+      </w:pPr>
+      <w:r>
+        <w:rPr>
+          <w:b/>
+        </w:rPr>
+        <w:t xml:space="preserve">Hộp thoại:</w:t>
+      </w:r>
+    </w:p>
+    <w:p>
+      <w:pPr>
+        <w:pStyle w:val="ETCContent"/>
+      </w:pPr>
+      <w:r>
+        <w:t xml:space="preserve">{%p for dlg in feat.dialogs %}</w:t>
+      </w:r>
+    </w:p>
+    <w:p>
+      <w:pPr>
+        <w:pStyle w:val="ETCContent"/>
+      </w:pPr>
+      <w:r>
+        <w:rPr>
+          <w:b/>
+        </w:rPr>
+        <w:t xml:space="preserve">• {{ dlg.title }}:</w:t>
+      </w:r>
+    </w:p>
+    <w:p>
+      <w:pPr>
+        <w:pStyle w:val="ETCContent"/>
+      </w:pPr>
+      <w:r>
+        <w:t xml:space="preserve">{%p for comp in dlg.components %}</w:t>
+      </w:r>
+    </w:p>
+    <w:p>
+      <w:pPr>
+        <w:pStyle w:val="ETCContent"/>
+      </w:pPr>
+      <w:r>
+        <w:t xml:space="preserve">  – {{ comp.name }}: {{ comp.description }}</w:t>
+      </w:r>
+    </w:p>
+    <w:p>
+      <w:pPr>
+        <w:pStyle w:val="ETCContent"/>
+      </w:pPr>
+      <w:r>
+        <w:t xml:space="preserve">{%p endfor %}</w:t>
+      </w:r>
+    </w:p>
+    <w:p>
+      <w:pPr>
+        <w:pStyle w:val="ETCContent"/>
+      </w:pPr>
+      <w:r>
+        <w:t xml:space="preserve">{%p endfor %}</w:t>
+      </w:r>
+    </w:p>
+    <w:p>
+      <w:pPr>
+        <w:pStyle w:val="ETCContent"/>
+      </w:pPr>
+      <w:r>
+        <w:t xml:space="preserve">{%p endif %}</w:t>
+      </w:r>
+    </w:p>
+    <w:p>
+      <w:pPr>
+        <w:pStyle w:val="ETCContent"/>
+      </w:pPr>
+      <w:r>
         <w:t>{%p if feat.error_cases %}</w:t>
       </w:r>
     </w:p>
@@ -6002,7 +6080,7 @@
       <w:headerReference w:type="even" r:id="rId16"/>
       <w:footerReference w:type="even" r:id="rId17"/>
       <w:pgSz w:w="11900" w:h="16840" w:orient="portrait"/>
-      <w:pgMar w:top="1440" w:right="1388" w:bottom="1440" w:left="1440" w:header="708" w:footer="708" w:gutter="0"/>
+      <w:pgMar w:top="1134" w:right="850" w:bottom="1134" w:left="1701" w:header="708" w:footer="708" w:gutter="0"/>
       <w:cols w:space="708"/>
       <w:titlePg/>
       <w:docGrid w:linePitch="360"/>
@@ -6042,174 +6120,47 @@
 <w:ftr xmlns:wpc="http://schemas.microsoft.com/office/word/2010/wordprocessingCanvas" xmlns:cx="http://schemas.microsoft.com/office/drawing/2014/chartex" xmlns:cx1="http://schemas.microsoft.com/office/drawing/2015/9/8/chartex" xmlns:cx2="http://schemas.microsoft.com/office/drawing/2015/10/21/chartex" xmlns:cx3="http://schemas.microsoft.com/office/drawing/2016/5/9/chartex" xmlns:cx4="http://schemas.microsoft.com/office/drawing/2016/5/10/chartex" xmlns:cx5="http://schemas.microsoft.com/office/drawing/2016/5/11/chartex" xmlns:cx6="http://schemas.microsoft.com/office/drawing/2016/5/12/chartex" xmlns:cx7="http://schemas.microsoft.com/office/drawing/2016/5/13/chartex" xmlns:cx8="http://schemas.microsoft.com/office/drawing/2016/5/14/chartex" xmlns:mc="http://schemas.openxmlformats.org/markup-compatibility/2006" xmlns:aink="http://schemas.microsoft.com/office/drawing/2016/ink" xmlns:am3d="http://schemas.microsoft.com/office/drawing/2017/model3d" xmlns:o="urn:schemas-microsoft-com:office:office" xmlns:oel="http://schemas.microsoft.com/office/2019/extlst" xmlns:r="http://schemas.openxmlformats.org/officeDocument/2006/relationships" xmlns:m="http://schemas.openxmlformats.org/officeDocument/2006/math" xmlns:v="urn:schemas-microsoft-com:vml" xmlns:wp14="http://schemas.microsoft.com/office/word/2010/wordprocessingDrawing" xmlns:wp="http://schemas.openxmlformats.org/drawingml/2006/wordprocessingDrawing" xmlns:w10="urn:schemas-microsoft-com:office:word" xmlns:w="http://schemas.openxmlformats.org/wordprocessingml/2006/main" xmlns:w14="http://schemas.microsoft.com/office/word/2010/wordml" xmlns:w15="http://schemas.microsoft.com/office/word/2012/wordml" xmlns:w16cex="http://schemas.microsoft.com/office/word/2018/wordml/cex" xmlns:w16cid="http://schemas.microsoft.com/office/word/2016/wordml/cid" xmlns:w16="http://schemas.microsoft.com/office/word/2018/wordml" xmlns:w16du="http://schemas.microsoft.com/office/word/2023/wordml/word16du" xmlns:w16sdtdh="http://schemas.microsoft.com/office/word/2020/wordml/sdtdatahash" xmlns:w16sdtfl="http://schemas.microsoft.com/office/word/2024/wordml/sdtformatlock" xmlns:w16se="http://schemas.microsoft.com/office/word/2015/wordml/symex" xmlns:wpg="http://schemas.microsoft.com/office/word/2010/wordprocessingGroup" xmlns:wpi="http://schemas.microsoft.com/office/word/2010/wordprocessingInk" xmlns:wne="http://schemas.microsoft.com/office/word/2006/wordml" xmlns:wps="http://schemas.microsoft.com/office/word/2010/wordprocessingShape" mc:Ignorable="w14 w15 w16se w16cid w16 w16cex w16sdtdh w16sdtfl w16du wp14">
   <w:p>
     <w:pPr>
-      <w:pStyle w:val="Footer"/>
+      <w:jc w:val="right"/>
+    </w:pPr>
+    <w:r>
       <w:rPr>
         <w:rFonts w:ascii="Times New Roman" w:hAnsi="Times New Roman" w:cs="Times New Roman"/>
-      </w:rPr>
-    </w:pPr>
-    <w:r>
-      <w:rPr>
-        <w:rFonts w:ascii="Times New Roman" w:hAnsi="Times New Roman" w:cs="Times New Roman"/>
-      </w:rPr>
-      <w:t>Mã</w:t>
-    </w:r>
-    <w:r>
-      <w:rPr>
-        <w:rFonts w:ascii="Times New Roman" w:hAnsi="Times New Roman" w:cs="Times New Roman"/>
-      </w:rPr>
-      <w:t xml:space="preserve">: </w:t>
-    </w:r>
-    <w:r>
-      <w:rPr>
-        <w:rFonts w:ascii="Times New Roman" w:hAnsi="Times New Roman" w:cs="Times New Roman"/>
-      </w:rPr>
-      <w:t>BM.</w:t>
-    </w:r>
-    <w:r>
-      <w:rPr>
-        <w:rFonts w:ascii="Times New Roman" w:hAnsi="Times New Roman" w:cs="Times New Roman"/>
-      </w:rPr>
-      <w:t>QT.04</w:t>
-    </w:r>
-    <w:r>
-      <w:rPr>
-        <w:rFonts w:ascii="Times New Roman" w:hAnsi="Times New Roman" w:cs="Times New Roman"/>
-      </w:rPr>
-      <w:t>.</w:t>
-    </w:r>
-    <w:r>
-      <w:rPr>
-        <w:rFonts w:ascii="Times New Roman" w:hAnsi="Times New Roman" w:cs="Times New Roman"/>
-      </w:rPr>
-      <w:t>05</w:t>
-    </w:r>
-    <w:r>
-      <w:rPr>
-        <w:rFonts w:ascii="Times New Roman" w:hAnsi="Times New Roman" w:cs="Times New Roman"/>
-      </w:rPr>
-      <w:t xml:space="preserve">PL: </w:t>
-    </w:r>
-    <w:r>
-      <w:rPr>
-        <w:rFonts w:ascii="Times New Roman" w:hAnsi="Times New Roman" w:cs="Times New Roman"/>
-      </w:rPr>
-      <w:t>Internal</w:t>
-    </w:r>
-    <w:r>
-      <w:rPr>
-        <w:rFonts w:ascii="Times New Roman" w:hAnsi="Times New Roman" w:cs="Times New Roman"/>
-      </w:rPr>
-      <w:t>Page</w:t>
-    </w:r>
-    <w:r>
-      <w:rPr>
-        <w:rFonts w:ascii="Times New Roman" w:hAnsi="Times New Roman" w:cs="Times New Roman"/>
-      </w:rPr>
-      <w:t xml:space="preserve"> </w:t>
-    </w:r>
-    <w:r>
-      <w:rPr>
-        <w:rFonts w:ascii="Times New Roman" w:hAnsi="Times New Roman" w:cs="Times New Roman"/>
-        <w:b w:val="1"/>
-        <w:bCs w:val="1"/>
-        <w:noProof/>
+        <w:sz w:val="22"/>
+        <w:szCs w:val="22"/>
       </w:rPr>
       <w:fldChar w:fldCharType="begin"/>
     </w:r>
     <w:r>
       <w:rPr>
         <w:rFonts w:ascii="Times New Roman" w:hAnsi="Times New Roman" w:cs="Times New Roman"/>
-        <w:b w:val="1"/>
-        <w:bCs w:val="1"/>
-      </w:rPr>
-      <w:instrText xml:space="preserve"> PAGE  \* Arabic  \* MERGEFORMAT </w:instrText>
+        <w:sz w:val="22"/>
+        <w:szCs w:val="22"/>
+      </w:rPr>
+      <w:instrText xml:space="preserve"> PAGE </w:instrText>
     </w:r>
     <w:r>
       <w:rPr>
         <w:rFonts w:ascii="Times New Roman" w:hAnsi="Times New Roman" w:cs="Times New Roman"/>
-        <w:b w:val="1"/>
-        <w:bCs w:val="1"/>
+        <w:sz w:val="22"/>
+        <w:szCs w:val="22"/>
       </w:rPr>
       <w:fldChar w:fldCharType="separate"/>
     </w:r>
     <w:r>
       <w:rPr>
         <w:rFonts w:ascii="Times New Roman" w:hAnsi="Times New Roman" w:cs="Times New Roman"/>
-        <w:b w:val="1"/>
-        <w:bCs w:val="1"/>
-        <w:noProof/>
+        <w:sz w:val="22"/>
+        <w:szCs w:val="22"/>
       </w:rPr>
       <w:t>1</w:t>
     </w:r>
     <w:r>
       <w:rPr>
         <w:rFonts w:ascii="Times New Roman" w:hAnsi="Times New Roman" w:cs="Times New Roman"/>
-        <w:b w:val="1"/>
-        <w:bCs w:val="1"/>
-        <w:noProof/>
+        <w:sz w:val="22"/>
+        <w:szCs w:val="22"/>
       </w:rPr>
       <w:fldChar w:fldCharType="end"/>
-    </w:r>
-    <w:r>
-      <w:rPr>
-        <w:rFonts w:ascii="Times New Roman" w:hAnsi="Times New Roman" w:cs="Times New Roman"/>
-      </w:rPr>
-      <w:t xml:space="preserve"> of </w:t>
-    </w:r>
-    <w:r>
-      <w:rPr>
-        <w:rFonts w:ascii="Times New Roman" w:hAnsi="Times New Roman" w:cs="Times New Roman"/>
-        <w:b w:val="1"/>
-        <w:bCs w:val="1"/>
-        <w:noProof/>
-      </w:rPr>
-      <w:fldChar w:fldCharType="begin"/>
-    </w:r>
-    <w:r>
-      <w:rPr>
-        <w:rFonts w:ascii="Times New Roman" w:hAnsi="Times New Roman" w:cs="Times New Roman"/>
-        <w:b w:val="1"/>
-        <w:bCs w:val="1"/>
-      </w:rPr>
-      <w:instrText xml:space="preserve"> NUMPAGES  \* Arabic  \* MERGEFORMAT </w:instrText>
-    </w:r>
-    <w:r>
-      <w:rPr>
-        <w:rFonts w:ascii="Times New Roman" w:hAnsi="Times New Roman" w:cs="Times New Roman"/>
-        <w:b w:val="1"/>
-        <w:bCs w:val="1"/>
-      </w:rPr>
-      <w:fldChar w:fldCharType="separate"/>
-    </w:r>
-    <w:r>
-      <w:rPr>
-        <w:rFonts w:ascii="Times New Roman" w:hAnsi="Times New Roman" w:cs="Times New Roman"/>
-        <w:b w:val="1"/>
-        <w:bCs w:val="1"/>
-        <w:noProof/>
-      </w:rPr>
-      <w:t>2</w:t>
-    </w:r>
-    <w:r>
-      <w:rPr>
-        <w:rFonts w:ascii="Times New Roman" w:hAnsi="Times New Roman" w:cs="Times New Roman"/>
-        <w:b w:val="1"/>
-        <w:bCs w:val="1"/>
-        <w:noProof/>
-      </w:rPr>
-      <w:fldChar w:fldCharType="end"/>
-    </w:r>
-    <w:r>
-      <w:rPr>
-        <w:rFonts w:ascii="Times New Roman" w:hAnsi="Times New Roman" w:cs="Times New Roman"/>
-      </w:rPr>
-      <w:ptab w:alignment="center" w:relativeTo="margin" w:leader="none"/>
-    </w:r>
-    <w:r>
-      <w:rPr>
-        <w:rFonts w:ascii="Times New Roman" w:hAnsi="Times New Roman" w:cs="Times New Roman"/>
-      </w:rPr>
-      <w:ptab w:alignment="right" w:relativeTo="margin" w:leader="none"/>
     </w:r>
   </w:p>
 </w:ftr>
@@ -6334,154 +6285,21 @@
       <w:rPr>
         <w:noProof/>
       </w:rPr>
-      <mc:AlternateContent>
-        <mc:Choice Requires="wps">
-          <w:drawing>
-            <wp:anchor distT="4294967294" distB="4294967294" distL="114300" distR="114300" simplePos="0" relativeHeight="251659264" behindDoc="0" locked="0" layoutInCell="1" allowOverlap="1" wp14:anchorId="3307F94E" wp14:editId="53F3EB3E">
-              <wp:simplePos x="0" y="0"/>
-              <wp:positionH relativeFrom="column">
-                <wp:posOffset>-19050</wp:posOffset>
-              </wp:positionH>
-              <wp:positionV relativeFrom="paragraph">
-                <wp:posOffset>152399</wp:posOffset>
-              </wp:positionV>
-              <wp:extent cx="5962650" cy="0"/>
-              <wp:effectExtent l="0" t="0" r="0" b="0"/>
-              <wp:wrapNone/>
-              <wp:docPr id="74507" name="Straight Arrow Connector 100"/>
-              <wp:cNvGraphicFramePr>
-                <a:graphicFrameLocks xmlns:a="http://schemas.openxmlformats.org/drawingml/2006/main"/>
-              </wp:cNvGraphicFramePr>
-              <a:graphic xmlns:a="http://schemas.openxmlformats.org/drawingml/2006/main">
-                <a:graphicData uri="http://schemas.microsoft.com/office/word/2010/wordprocessingShape">
-                  <wps:wsp>
-                    <wps:cNvCnPr>
-                      <a:cxnSpLocks/>
-                    </wps:cNvCnPr>
-                    <wps:spPr bwMode="auto">
-                      <a:xfrm>
-                        <a:off x="0" y="0"/>
-                        <a:ext cx="5962650" cy="0"/>
-                      </a:xfrm>
-                      <a:prstGeom prst="straightConnector1">
-                        <a:avLst/>
-                      </a:prstGeom>
-                      <a:noFill/>
-                      <a:ln w="9525">
-                        <a:solidFill>
-                          <a:srgbClr val="ED7D31">
-                            <a:lumMod val="50000"/>
-                            <a:lumOff val="0"/>
-                          </a:srgbClr>
-                        </a:solidFill>
-                        <a:round/>
-                        <a:headEnd/>
-                        <a:tailEnd/>
-                      </a:ln>
-                    </wps:spPr>
-                    <wps:bodyPr/>
-                  </wps:wsp>
-                </a:graphicData>
-              </a:graphic>
-              <wp14:sizeRelH relativeFrom="page">
-                <wp14:pctWidth>0</wp14:pctWidth>
-              </wp14:sizeRelH>
-              <wp14:sizeRelV relativeFrom="page">
-                <wp14:pctHeight>0</wp14:pctHeight>
-              </wp14:sizeRelV>
-            </wp:anchor>
-          </w:drawing>
-        </mc:Choice>
-        <mc:Fallback>
-          <w:pict w14:anchorId="122357B2">
-            <v:shapetype id="_x0000_t32" coordsize="21600,21600" o:oned="t" filled="f" o:spt="32" path="m,l21600,21600e" w14:anchorId="3299874C">
-              <v:path fillok="f" arrowok="t" o:connecttype="none"/>
-              <o:lock v:ext="edit" shapetype="t"/>
-            </v:shapetype>
-            <v:shape id="Straight Arrow Connector 100" style="position:absolute;margin-left:-1.5pt;margin-top:12pt;width:469.5pt;height:0;z-index:251659264;visibility:visible;mso-wrap-style:square;mso-width-percent:0;mso-height-percent:0;mso-wrap-distance-left:9pt;mso-wrap-distance-top:-6e-5mm;mso-wrap-distance-right:9pt;mso-wrap-distance-bottom:-6e-5mm;mso-position-horizontal:absolute;mso-position-horizontal-relative:text;mso-position-vertical:absolute;mso-position-vertical-relative:text;mso-width-percent:0;mso-height-percent:0;mso-width-relative:page;mso-height-relative:page" o:spid="_x0000_s1026" strokecolor="#843c0c" type="#_x0000_t32" o:gfxdata="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">
-              <o:lock v:ext="edit" shapetype="f"/>
-            </v:shape>
-          </w:pict>
-        </mc:Fallback>
-      </mc:AlternateContent>
+      <w:t>{{ project.code }} - Tài liệu hướng dẫn sử dụng</w:t>
+      <w:tab/>
+      <w:tab/>
+      <w:t>Phiên bản: {{ meta.version or '1.0' }}</w:t>
     </w:r>
     <w:r>
       <w:rPr>
         <w:noProof/>
       </w:rPr>
-      <mc:AlternateContent>
-        <mc:Choice Requires="wps">
-          <w:drawing>
-            <wp:anchor distT="4294967294" distB="4294967294" distL="114300" distR="114300" simplePos="0" relativeHeight="251660288" behindDoc="0" locked="0" layoutInCell="1" allowOverlap="1" wp14:anchorId="4F94956B" wp14:editId="1235194B">
-              <wp:simplePos x="0" y="0"/>
-              <wp:positionH relativeFrom="column">
-                <wp:posOffset>-19050</wp:posOffset>
-              </wp:positionH>
-              <wp:positionV relativeFrom="paragraph">
-                <wp:posOffset>190499</wp:posOffset>
-              </wp:positionV>
-              <wp:extent cx="5962650" cy="0"/>
-              <wp:effectExtent l="0" t="12700" r="6350" b="0"/>
-              <wp:wrapNone/>
-              <wp:docPr id="74506" name="Straight Arrow Connector 98"/>
-              <wp:cNvGraphicFramePr>
-                <a:graphicFrameLocks xmlns:a="http://schemas.openxmlformats.org/drawingml/2006/main"/>
-              </wp:cNvGraphicFramePr>
-              <a:graphic xmlns:a="http://schemas.openxmlformats.org/drawingml/2006/main">
-                <a:graphicData uri="http://schemas.microsoft.com/office/word/2010/wordprocessingShape">
-                  <wps:wsp>
-                    <wps:cNvCnPr>
-                      <a:cxnSpLocks/>
-                    </wps:cNvCnPr>
-                    <wps:spPr bwMode="auto">
-                      <a:xfrm>
-                        <a:off x="0" y="0"/>
-                        <a:ext cx="5962650" cy="0"/>
-                      </a:xfrm>
-                      <a:prstGeom prst="straightConnector1">
-                        <a:avLst/>
-                      </a:prstGeom>
-                      <a:noFill/>
-                      <a:ln w="25400">
-                        <a:solidFill>
-                          <a:srgbClr val="ED7D31">
-                            <a:lumMod val="50000"/>
-                            <a:lumOff val="0"/>
-                          </a:srgbClr>
-                        </a:solidFill>
-                        <a:round/>
-                        <a:headEnd/>
-                        <a:tailEnd/>
-                      </a:ln>
-                    </wps:spPr>
-                    <wps:bodyPr/>
-                  </wps:wsp>
-                </a:graphicData>
-              </a:graphic>
-              <wp14:sizeRelH relativeFrom="page">
-                <wp14:pctWidth>0</wp14:pctWidth>
-              </wp14:sizeRelH>
-              <wp14:sizeRelV relativeFrom="page">
-                <wp14:pctHeight>0</wp14:pctHeight>
-              </wp14:sizeRelV>
-            </wp:anchor>
-          </w:drawing>
-        </mc:Choice>
-        <mc:Fallback>
-          <w:pict w14:anchorId="09AED2C6">
-            <v:shape id="Straight Arrow Connector 98" style="position:absolute;margin-left:-1.5pt;margin-top:15pt;width:469.5pt;height:0;z-index:251660288;visibility:visible;mso-wrap-style:square;mso-width-percent:0;mso-height-percent:0;mso-wrap-distance-left:9pt;mso-wrap-distance-top:-6e-5mm;mso-wrap-distance-right:9pt;mso-wrap-distance-bottom:-6e-5mm;mso-position-horizontal:absolute;mso-position-horizontal-relative:text;mso-position-vertical:absolute;mso-position-vertical-relative:text;mso-width-percent:0;mso-height-percent:0;mso-width-relative:page;mso-height-relative:page" o:spid="_x0000_s1026" strokecolor="#843c0c" strokeweight="2pt" type="#_x0000_t32" o:gfxdata="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" w14:anchorId="738BE45C">
-              <o:lock v:ext="edit" shapetype="f"/>
-            </v:shape>
-          </w:pict>
-        </mc:Fallback>
-      </mc:AlternateContent>
     </w:r>
     <w:r>
       <w:rPr>
         <w:rFonts w:ascii="Times New Roman" w:hAnsi="Times New Roman" w:cs="Times New Roman"/>
         <w:i/>
       </w:rPr>
-      <w:t>&lt;</w:t>
     </w:r>
     <w:proofErr w:type="spellStart"/>
     <w:r>
@@ -6489,7 +6307,6 @@
         <w:rFonts w:ascii="Times New Roman" w:hAnsi="Times New Roman" w:cs="Times New Roman"/>
         <w:i/>
       </w:rPr>
-      <w:t>Mã</w:t>
     </w:r>
     <w:proofErr w:type="spellEnd"/>
     <w:r>
@@ -6497,7 +6314,6 @@
         <w:rFonts w:ascii="Times New Roman" w:hAnsi="Times New Roman" w:cs="Times New Roman"/>
         <w:i/>
       </w:rPr>
-      <w:t xml:space="preserve"> </w:t>
     </w:r>
     <w:proofErr w:type="spellStart"/>
     <w:r>
@@ -6505,7 +6321,6 @@
         <w:rFonts w:ascii="Times New Roman" w:hAnsi="Times New Roman" w:cs="Times New Roman"/>
         <w:i/>
       </w:rPr>
-      <w:t>dự</w:t>
     </w:r>
     <w:proofErr w:type="spellEnd"/>
     <w:r>
@@ -6513,7 +6328,6 @@
         <w:rFonts w:ascii="Times New Roman" w:hAnsi="Times New Roman" w:cs="Times New Roman"/>
         <w:i/>
       </w:rPr>
-      <w:t xml:space="preserve"> </w:t>
     </w:r>
     <w:proofErr w:type="spellStart"/>
     <w:r>
@@ -6521,7 +6335,6 @@
         <w:rFonts w:ascii="Times New Roman" w:hAnsi="Times New Roman" w:cs="Times New Roman"/>
         <w:i/>
       </w:rPr>
-      <w:t>án</w:t>
     </w:r>
     <w:proofErr w:type="spellEnd"/>
     <w:r>
@@ -6529,7 +6342,6 @@
         <w:rFonts w:ascii="Times New Roman" w:hAnsi="Times New Roman" w:cs="Times New Roman"/>
         <w:i/>
       </w:rPr>
-      <w:t xml:space="preserve">&gt; - Tài </w:t>
     </w:r>
     <w:proofErr w:type="spellStart"/>
     <w:r>
@@ -6537,7 +6349,6 @@
         <w:rFonts w:ascii="Times New Roman" w:hAnsi="Times New Roman" w:cs="Times New Roman"/>
         <w:i/>
       </w:rPr>
-      <w:t>liệu</w:t>
     </w:r>
     <w:proofErr w:type="spellEnd"/>
     <w:r>
@@ -6545,7 +6356,6 @@
         <w:rFonts w:ascii="Times New Roman" w:hAnsi="Times New Roman" w:cs="Times New Roman"/>
         <w:i/>
       </w:rPr>
-      <w:t xml:space="preserve"> </w:t>
     </w:r>
     <w:proofErr w:type="spellStart"/>
     <w:r>
@@ -6553,7 +6363,6 @@
         <w:rFonts w:ascii="Times New Roman" w:hAnsi="Times New Roman" w:cs="Times New Roman"/>
         <w:i/>
       </w:rPr>
-      <w:t>hướng</w:t>
     </w:r>
     <w:proofErr w:type="spellEnd"/>
     <w:r>
@@ -6561,7 +6370,6 @@
         <w:rFonts w:ascii="Times New Roman" w:hAnsi="Times New Roman" w:cs="Times New Roman"/>
         <w:i/>
       </w:rPr>
-      <w:t xml:space="preserve"> </w:t>
     </w:r>
     <w:proofErr w:type="spellStart"/>
     <w:r>
@@ -6569,7 +6377,6 @@
         <w:rFonts w:ascii="Times New Roman" w:hAnsi="Times New Roman" w:cs="Times New Roman"/>
         <w:i/>
       </w:rPr>
-      <w:t>dẫn</w:t>
     </w:r>
     <w:proofErr w:type="spellEnd"/>
     <w:r>
@@ -6577,7 +6384,6 @@
         <w:rFonts w:ascii="Times New Roman" w:hAnsi="Times New Roman" w:cs="Times New Roman"/>
         <w:i/>
       </w:rPr>
-      <w:t xml:space="preserve"> </w:t>
     </w:r>
     <w:proofErr w:type="spellStart"/>
     <w:r>
@@ -6585,7 +6391,6 @@
         <w:rFonts w:ascii="Times New Roman" w:hAnsi="Times New Roman" w:cs="Times New Roman"/>
         <w:i/>
       </w:rPr>
-      <w:t>sử</w:t>
     </w:r>
     <w:proofErr w:type="spellEnd"/>
     <w:r>
@@ -6593,7 +6398,6 @@
         <w:rFonts w:ascii="Times New Roman" w:hAnsi="Times New Roman" w:cs="Times New Roman"/>
         <w:i/>
       </w:rPr>
-      <w:t xml:space="preserve"> </w:t>
     </w:r>
     <w:proofErr w:type="spellStart"/>
     <w:r>
@@ -6601,7 +6405,6 @@
         <w:rFonts w:ascii="Times New Roman" w:hAnsi="Times New Roman" w:cs="Times New Roman"/>
         <w:i/>
       </w:rPr>
-      <w:t>dụng</w:t>
     </w:r>
     <w:proofErr w:type="spellEnd"/>
     <w:r>
@@ -6609,14 +6412,12 @@
         <w:rFonts w:ascii="Times New Roman" w:hAnsi="Times New Roman" w:cs="Times New Roman"/>
         <w:i/>
       </w:rPr>
-      <w:tab/>
     </w:r>
     <w:r>
       <w:rPr>
         <w:rFonts w:ascii="Times New Roman" w:hAnsi="Times New Roman" w:cs="Times New Roman"/>
         <w:i/>
       </w:rPr>
-      <w:tab/>
     </w:r>
     <w:proofErr w:type="spellStart"/>
     <w:r>
@@ -6624,7 +6425,6 @@
         <w:rFonts w:ascii="Times New Roman" w:hAnsi="Times New Roman" w:cs="Times New Roman"/>
         <w:i/>
       </w:rPr>
-      <w:t>Phiên</w:t>
     </w:r>
     <w:proofErr w:type="spellEnd"/>
     <w:r>
@@ -6632,7 +6432,6 @@
         <w:rFonts w:ascii="Times New Roman" w:hAnsi="Times New Roman" w:cs="Times New Roman"/>
         <w:i/>
       </w:rPr>
-      <w:t xml:space="preserve"> </w:t>
     </w:r>
     <w:proofErr w:type="spellStart"/>
     <w:r>
@@ -6640,7 +6439,6 @@
         <w:rFonts w:ascii="Times New Roman" w:hAnsi="Times New Roman" w:cs="Times New Roman"/>
         <w:i/>
       </w:rPr>
-      <w:t>bản</w:t>
     </w:r>
     <w:proofErr w:type="spellEnd"/>
     <w:r>
@@ -6648,7 +6446,6 @@
         <w:rFonts w:ascii="Times New Roman" w:hAnsi="Times New Roman" w:cs="Times New Roman"/>
         <w:i/>
       </w:rPr>
-      <w:t xml:space="preserve">: </w:t>
     </w:r>
     <w:r>
       <w:rPr>
@@ -6656,7 +6453,6 @@
         <w:i/>
         <w:color w:val="808080" w:themeColor="background1" w:themeShade="80"/>
       </w:rPr>
-      <w:t>&lt;xx&gt;</w:t>
     </w:r>
   </w:p>
   <w:p>
@@ -14907,11 +14703,12 @@
       <w:jc w:val="both"/>
     </w:pPr>
     <w:rPr>
-      <w:rFonts w:ascii="Times New Roman Bold" w:hAnsi="Times New Roman Bold" w:eastAsia="Arial Unicode MS" w:cs="Times New Roman"/>
+      <w:rFonts w:ascii="Times New Roman" w:hAnsi="Times New Roman" w:eastAsia="Arial Unicode MS" w:cs="Times New Roman"/>
+      <w:b/>
       <w:bCs w:val="0"/>
       <w:color w:val="000000" w:themeColor="text1"/>
       <w:kern w:val="28"/>
-      <w:sz w:val="22"/>
+      <w:sz w:val="28"/>
       <w:szCs w:val="44"/>
       <w:lang w:val="en-AU"/>
     </w:rPr>
@@ -14931,13 +14728,15 @@
       </w:numPr>
       <w:shd w:val="clear" w:color="auto" w:fill="F2F2F2" w:themeFill="background1" w:themeFillShade="F2"/>
       <w:spacing w:before="160" w:after="160" w:line="288" w:lineRule="auto"/>
+      <w:jc w:val="both"/>
     </w:pPr>
     <w:rPr>
       <w:rFonts w:ascii="Times New Roman" w:hAnsi="Times New Roman" w:eastAsia="Arial Unicode MS" w:cs="Times New Roman"/>
+      <w:b/>
       <w:bCs w:val="0"/>
       <w:color w:val="000000" w:themeColor="text1"/>
       <w:kern w:val="28"/>
-      <w:sz w:val="22"/>
+      <w:sz w:val="26"/>
       <w:szCs w:val="44"/>
       <w:lang w:val="en-AU"/>
     </w:rPr>
@@ -14960,12 +14759,13 @@
     </w:pPr>
     <w:rPr>
       <w:rFonts w:ascii="Times New Roman" w:hAnsi="Times New Roman" w:eastAsia="Arial Unicode MS" w:cs="Times New Roman"/>
+      <w:b/>
       <w:bCs w:val="0"/>
       <w:i/>
       <w:iCs/>
       <w:color w:val="000000" w:themeColor="text1"/>
       <w:kern w:val="28"/>
-      <w:sz w:val="22"/>
+      <w:sz w:val="26"/>
       <w:szCs w:val="44"/>
       <w:lang w:val="en-AU"/>
     </w:rPr>
@@ -14988,12 +14788,15 @@
     </w:pPr>
     <w:rPr>
       <w:rFonts w:ascii="Times New Roman" w:hAnsi="Times New Roman" w:eastAsia="MS Mincho" w:cs="Times New Roman"/>
+      <w:b/>
       <w:bCs w:val="0"/>
+      <w:i/>
       <w:iCs w:val="0"/>
       <w:noProof/>
       <w:snapToGrid w:val="0"/>
       <w:color w:val="000000" w:themeColor="text1"/>
       <w:kern w:val="28"/>
+      <w:sz w:val="26"/>
       <w:szCs w:val="28"/>
       <w:lang w:val="en-AU" w:eastAsia="ja-JP"/>
     </w:rPr>
@@ -15168,10 +14971,11 @@
     <w:pPr>
       <w:widowControl w:val="0"/>
       <w:spacing w:before="120" w:after="0" w:line="312" w:lineRule="auto"/>
-      <w:jc w:val="center"/>
+      <w:jc w:val="both"/>
     </w:pPr>
     <w:rPr>
       <w:rFonts w:ascii="Times New Roman" w:hAnsi="Times New Roman" w:eastAsia="Times New Roman" w:cs="Times New Roman"/>
+      <w:sz w:val="26"/>
     </w:rPr>
   </w:style>
   <w:style w:type="table" w:styleId="ETCTableStyle" w:customStyle="1">

</xml_diff>